<commit_message>
Đồng bộ hai website theo app bản 174 (HĐTN theo vị trí tiết, Tiếng Việt 2 tách giáo án gộp, các tiết ôn tập và kiểm tra)
Co-Authored-By: Claude Opus 5 <noreply@anthropic.com>
</commit_message>
<xml_diff>
--- a/assets/docs/lop1/Hoat dong trai nghiem - Lop 1.docx
+++ b/assets/docs/lop1/Hoat dong trai nghiem - Lop 1.docx
@@ -1925,6 +1925,19 @@
               <w:spacing w:after="0"/>
             </w:pPr>
             <w:r/>
+            <w:r>
+              <w:rPr>
+                <w:b w:val="0"/>
+                <w:i w:val="0"/>
+                <w:sz w:val="18"/>
+              </w:rPr>
+              <w:t>Năng lực số 1.1 CB1b: HS hình dung và kể lại được việc sắp làm sau khi xem ảnh, video minh hoạ</w:t>
+            </w:r>
+          </w:p>
+          <w:p>
+            <w:pPr>
+              <w:spacing w:after="0"/>
+            </w:pPr>
             <w:r>
               <w:rPr>
                 <w:b w:val="0"/>

</xml_diff>